<commit_message>
updates 4/2 lots of stuff
</commit_message>
<xml_diff>
--- a/Writing/VSAT procedure write-up.docx
+++ b/Writing/VSAT procedure write-up.docx
@@ -1,262 +1,138 @@
 
 <file path=word/document.xml><?xml version="1.0" encoding="utf-8"?>
-<w:document xmlns:mc="http://schemas.openxmlformats.org/markup-compatibility/2006" xmlns:o="urn:schemas-microsoft-com:office:office" xmlns:r="http://schemas.openxmlformats.org/officeDocument/2006/relationships" xmlns:m="http://schemas.openxmlformats.org/officeDocument/2006/math" xmlns:v="urn:schemas-microsoft-com:vml" xmlns:wp="http://schemas.openxmlformats.org/drawingml/2006/wordprocessingDrawing" xmlns:w10="urn:schemas-microsoft-com:office:word" xmlns:w="http://schemas.openxmlformats.org/wordprocessingml/2006/main" xmlns:wne="http://schemas.microsoft.com/office/word/2006/wordml" xmlns:sl="http://schemas.openxmlformats.org/schemaLibrary/2006/main" xmlns:a="http://schemas.openxmlformats.org/drawingml/2006/main" xmlns:pic="http://schemas.openxmlformats.org/drawingml/2006/picture" xmlns:c="http://schemas.openxmlformats.org/drawingml/2006/chart" xmlns:lc="http://schemas.openxmlformats.org/drawingml/2006/lockedCanvas" xmlns:dgm="http://schemas.openxmlformats.org/drawingml/2006/diagram" xmlns:wps="http://schemas.microsoft.com/office/word/2010/wordprocessingShape" xmlns:wpg="http://schemas.microsoft.com/office/word/2010/wordprocessingGroup" xmlns:w14="http://schemas.microsoft.com/office/word/2010/wordml" xmlns:w15="http://schemas.microsoft.com/office/word/2012/wordml" xmlns:w16="http://schemas.microsoft.com/office/word/2018/wordml" xmlns:w16cex="http://schemas.microsoft.com/office/word/2018/wordml/cex" xmlns:w16cid="http://schemas.microsoft.com/office/word/2016/wordml/cid" xmlns="http://schemas.microsoft.com/office/tasks/2019/documenttasks" xmlns:cr="http://schemas.microsoft.com/office/comments/2020/reactions">
+<w:document xmlns:wpc="http://schemas.microsoft.com/office/word/2010/wordprocessingCanvas" xmlns:cx="http://schemas.microsoft.com/office/drawing/2014/chartex" xmlns:cx1="http://schemas.microsoft.com/office/drawing/2015/9/8/chartex" xmlns:cx2="http://schemas.microsoft.com/office/drawing/2015/10/21/chartex" xmlns:cx3="http://schemas.microsoft.com/office/drawing/2016/5/9/chartex" xmlns:cx4="http://schemas.microsoft.com/office/drawing/2016/5/10/chartex" xmlns:cx5="http://schemas.microsoft.com/office/drawing/2016/5/11/chartex" xmlns:cx6="http://schemas.microsoft.com/office/drawing/2016/5/12/chartex" xmlns:cx7="http://schemas.microsoft.com/office/drawing/2016/5/13/chartex" xmlns:cx8="http://schemas.microsoft.com/office/drawing/2016/5/14/chartex" xmlns:mc="http://schemas.openxmlformats.org/markup-compatibility/2006" xmlns:aink="http://schemas.microsoft.com/office/drawing/2016/ink" xmlns:am3d="http://schemas.microsoft.com/office/drawing/2017/model3d" xmlns:o="urn:schemas-microsoft-com:office:office" xmlns:oel="http://schemas.microsoft.com/office/2019/extlst" xmlns:r="http://schemas.openxmlformats.org/officeDocument/2006/relationships" xmlns:m="http://schemas.openxmlformats.org/officeDocument/2006/math" xmlns:v="urn:schemas-microsoft-com:vml" xmlns:wp14="http://schemas.microsoft.com/office/word/2010/wordprocessingDrawing" xmlns:wp="http://schemas.openxmlformats.org/drawingml/2006/wordprocessingDrawing" xmlns:w10="urn:schemas-microsoft-com:office:word" xmlns:w="http://schemas.openxmlformats.org/wordprocessingml/2006/main" xmlns:w14="http://schemas.microsoft.com/office/word/2010/wordml" xmlns:w15="http://schemas.microsoft.com/office/word/2012/wordml" xmlns:w16cex="http://schemas.microsoft.com/office/word/2018/wordml/cex" xmlns:w16cid="http://schemas.microsoft.com/office/word/2016/wordml/cid" xmlns:w16="http://schemas.microsoft.com/office/word/2018/wordml" xmlns:w16du="http://schemas.microsoft.com/office/word/2023/wordml/word16du" xmlns:w16sdtdh="http://schemas.microsoft.com/office/word/2020/wordml/sdtdatahash" xmlns:w16sdtfl="http://schemas.microsoft.com/office/word/2024/wordml/sdtformatlock" xmlns:w16se="http://schemas.microsoft.com/office/word/2015/wordml/symex" xmlns:wpg="http://schemas.microsoft.com/office/word/2010/wordprocessingGroup" xmlns:wpi="http://schemas.microsoft.com/office/word/2010/wordprocessingInk" xmlns:wne="http://schemas.microsoft.com/office/word/2006/wordml" xmlns:wps="http://schemas.microsoft.com/office/word/2010/wordprocessingShape" mc:Ignorable="w14 w15 w16se w16cid w16 w16cex w16sdtdh w16sdtfl w16du wp14">
   <w:body>
     <w:p>
-      <w:pPr>
-        <w:rPr/>
-      </w:pPr>
-      <w:r>
-        <w:rPr>
-          <w:rtl w:val="0"/>
-        </w:rPr>
-        <w:t xml:space="preserve">(Connect to previous sections)</w:t>
+      <w:r>
+        <w:t>(Connect to previous sections)</w:t>
       </w:r>
     </w:p>
+    <w:p/>
     <w:p>
-      <w:pPr>
-        <w:rPr/>
-      </w:pPr>
-      <w:r>
-        <w:rPr>
-          <w:rtl w:val="0"/>
-        </w:rPr>
+      <w:r>
+        <w:t xml:space="preserve">One angle we tried </w:t>
       </w:r>
     </w:p>
+    <w:p/>
     <w:p>
-      <w:pPr>
-        <w:rPr/>
-      </w:pPr>
-      <w:r>
-        <w:rPr>
-          <w:rtl w:val="0"/>
-        </w:rPr>
-        <w:t xml:space="preserve">One angle we tried </w:t>
+      <w:r>
+        <w:t>Like others his method is designed to evaluate how well each taxa aligns with a reference group (A) in a way that leverages the F-distribution by creating an ANOVA like situation. The idea is to replace the two-sample hypothesis test from the DCM procedure(reference) with one that works for multiple groups to obtain a p-value from a known distribution as the two condition case was able to.</w:t>
       </w:r>
     </w:p>
+    <w:p/>
     <w:p>
-      <w:pPr>
-        <w:rPr/>
-      </w:pPr>
-      <w:r>
-        <w:rPr>
-          <w:rtl w:val="0"/>
-        </w:rPr>
-      </w:r>
-    </w:p>
-    <w:p>
-      <w:pPr>
-        <w:rPr/>
-      </w:pPr>
-      <w:r>
-        <w:rPr>
-          <w:rtl w:val="0"/>
-        </w:rPr>
-        <w:t xml:space="preserve">Like others his method is designed to evaluate how well each taxa aligns with a reference group (A) in a way that leverages the F-distribution by creating an ANOVA like situation. The idea is to replace the two-sample hypothesis test from the DCM procedure(reference) with one that works for multiple groups to obtain a p-value from a known distribution as the two condition case was able to.</w:t>
-      </w:r>
-    </w:p>
-    <w:p>
-      <w:pPr>
-        <w:rPr/>
-      </w:pPr>
-      <w:r>
-        <w:rPr>
-          <w:rtl w:val="0"/>
-        </w:rPr>
-      </w:r>
-    </w:p>
-    <w:p>
-      <w:pPr>
-        <w:rPr/>
-      </w:pPr>
-      <w:r>
-        <w:rPr>
-          <w:rtl w:val="0"/>
-        </w:rPr>
-        <w:t xml:space="preserve">Given p variables, measured under k different conditions, with number of samples under each condition denoted n</w:t>
+      <w:r>
+        <w:t>Given p variables, measured under k different conditions, with number of samples under each condition denoted n</w:t>
       </w:r>
       <w:r>
         <w:rPr>
           <w:vertAlign w:val="subscript"/>
-          <w:rtl w:val="0"/>
         </w:rPr>
-        <w:t xml:space="preserve">k</w:t>
-      </w:r>
-      <w:r>
-        <w:rPr>
-          <w:rtl w:val="0"/>
-        </w:rPr>
-        <w:t xml:space="preserve">. We arrange the data into k separate p x n</w:t>
+        <w:t>k</w:t>
+      </w:r>
+      <w:r>
+        <w:t>. We arrange the data into k separate p x n</w:t>
       </w:r>
       <w:r>
         <w:rPr>
           <w:vertAlign w:val="subscript"/>
-          <w:rtl w:val="0"/>
         </w:rPr>
-        <w:t xml:space="preserve">k</w:t>
-      </w:r>
-      <w:r>
-        <w:rPr>
-          <w:rtl w:val="0"/>
-        </w:rPr>
+        <w:t>k</w:t>
+      </w:r>
+      <w:r>
         <w:t xml:space="preserve"> sub-dataframes, each row representing the measurements of a variable under each of the n</w:t>
       </w:r>
       <w:r>
         <w:rPr>
           <w:vertAlign w:val="subscript"/>
-          <w:rtl w:val="0"/>
         </w:rPr>
-        <w:t xml:space="preserve">k</w:t>
-      </w:r>
-      <w:r>
-        <w:rPr>
-          <w:rtl w:val="0"/>
-        </w:rPr>
+        <w:t>k</w:t>
+      </w:r>
+      <w:r>
         <w:t xml:space="preserve"> samples in treatment k. </w:t>
       </w:r>
-      <w:r>
-        <w:rPr>
-          <w:rtl w:val="0"/>
-        </w:rPr>
-      </w:r>
     </w:p>
+    <w:p/>
     <w:p>
-      <w:pPr>
-        <w:rPr/>
-      </w:pPr>
-      <w:r>
-        <w:rPr>
-          <w:rtl w:val="0"/>
-        </w:rPr>
+      <w:r>
+        <w:t>We define (LATEXify uij = (xij - xbar_ / sd(xi) ) to be the standardized contribution to correlation for a single treatment (here treatment 1). Due to the data matrix arrangement defined above, this amounts to row standardizing all data matrices so that values are standardized across measurements for an individual variable. In this form, inner products between rows correspond to sample correlations, and we can interpret uij * ulj as the contribution to the correlation between i and l in set A by sample j.</w:t>
       </w:r>
     </w:p>
+    <w:p/>
     <w:p>
-      <w:pPr>
-        <w:rPr/>
-      </w:pPr>
-      <w:r>
-        <w:rPr>
-          <w:rtl w:val="0"/>
-        </w:rPr>
-        <w:t xml:space="preserve">We define (LATEXify uij = (xij - xbar_ / sd(xi) ) to be the standardized contribution to correlation for a single treatment (here treatment 1). Due to the data matrix arrangement defined above, this amounts to row standardizing all data matrices so that values are standardized across measurements for an individual variable. In this form, inner products between rows correspond to sample correlations, and we can interpret uij * ulj as the contribution to the correlation between i and l in set A by sample j.</w:t>
+      <w:r>
+        <w:t>The VSAT procedure starts identically to DCM, we start with an initial set A (subset) {1, …, m} where m is the number of rows or variables in the data. We define the “connection”, or how similarly variables behave differentially across treatments, between variable i not in a set A and set A to be the average correlation between pairs i, l where l is in set A. This is equivalent to finding the covariance between the vector of scaled sample values for any variable not in set A and the vector of average sample values for all variables currently in set A. (Cov(uj, m1(treatment A))) We can use covariance to calculate this quantity because both the uis and m vectors are centered at 0.</w:t>
       </w:r>
     </w:p>
+    <w:p/>
     <w:p>
-      <w:pPr>
-        <w:rPr/>
-      </w:pPr>
-      <w:r>
-        <w:rPr>
-          <w:rtl w:val="0"/>
-        </w:rPr>
+      <w:r>
+        <w:t>This “connection” we defined as S1(i, A)) can be broken down into individual pieces, representing the individual contribution of each sample by taking uij and multiplying by m1j, the average value for things in A in the jth sample.</w:t>
       </w:r>
     </w:p>
+    <w:p/>
     <w:p>
-      <w:pPr>
-        <w:rPr/>
-      </w:pPr>
-      <w:r>
-        <w:rPr>
-          <w:rtl w:val="0"/>
-        </w:rPr>
-        <w:t xml:space="preserve">The VSAT procedure starts identically to DCM, we start with an initial set A (subset) {1, …, m} where m is the number of rows or variables in the data. We define the “connection”, or how similarly variables behave differentially across treatments, between variable i not in a set A and set A to be the average correlation between pairs i, l where l is in set A. This is equivalent to finding the covariance between the vector of scaled sample values for any variable not in set A and the vector of average sample values for all variables currently in set A. (Cov(uj, m1(treatment A))) We can use covariance to calculate this quantity because both the uis and m vectors are centered at 0.</w:t>
+      <w:r>
+        <w:t>These “contributions” create an anova situation, with S1, S2, S3 representing the average contribution so each individual contribution would be distributed around this value. (SHOW PLOT BELOW)</w:t>
       </w:r>
     </w:p>
+    <w:p/>
     <w:p>
-      <w:pPr>
-        <w:rPr/>
-      </w:pPr>
-      <w:r>
-        <w:rPr>
-          <w:rtl w:val="0"/>
-        </w:rPr>
+      <w:r>
+        <w:t>(</w:t>
+      </w:r>
+      <w:r>
+        <w:t>A variable</w:t>
+      </w:r>
+      <w:r>
+        <w:t>) is a clear example of a variable that exhibits similar differential behavior to that of the variables in A due to the clear separation of S1, S2 and S3 measurements, which quantify the difference in mean correlation between the variable and the set A across the three treatments</w:t>
+      </w:r>
+      <w:r>
+        <w:t xml:space="preserve">. </w:t>
       </w:r>
     </w:p>
+    <w:p/>
     <w:p>
-      <w:pPr>
-        <w:rPr/>
-      </w:pPr>
-      <w:r>
-        <w:rPr>
-          <w:rtl w:val="0"/>
-        </w:rPr>
-        <w:t xml:space="preserve">This “connection” we defined as S1(i, A)) can be broken down into individual pieces, representing the individual contribution of each sample by taking uij and multiplying by m1j, the average value for things in A in the jth sample.</w:t>
+      <w:r>
+        <w:lastRenderedPageBreak/>
+        <w:t>Importantly, these correlation contributions are not independent. Although the correlation</w:t>
+      </w:r>
+      <w:r>
+        <w:t>s</w:t>
+      </w:r>
+      <w:r>
+        <w:t xml:space="preserve"> between two variables </w:t>
+      </w:r>
+      <w:r>
+        <w:t>are</w:t>
+      </w:r>
+      <w:r>
+        <w:t xml:space="preserve"> independent</w:t>
+      </w:r>
+      <w:r>
+        <w:t>, because we standardize counts across each variable to calculate contributions, these are dependent. As a result, the contributions can be extremely non-normal. The plot below demonstrates</w:t>
       </w:r>
     </w:p>
-    <w:p>
-      <w:pPr>
-        <w:rPr/>
-      </w:pPr>
-      <w:r>
-        <w:rPr>
-          <w:rtl w:val="0"/>
-        </w:rPr>
-      </w:r>
-    </w:p>
-    <w:p>
-      <w:pPr>
-        <w:rPr/>
-      </w:pPr>
-      <w:r>
-        <w:rPr>
-          <w:rtl w:val="0"/>
-        </w:rPr>
-        <w:t xml:space="preserve">These “contributions” create an anova situation, with S1, S2, S3 representing the average contribution so each individual contribution would be distributed around this value. (SHOW PLOT BELOW)</w:t>
-      </w:r>
-    </w:p>
-    <w:p>
-      <w:pPr>
-        <w:rPr/>
-      </w:pPr>
-      <w:r>
-        <w:rPr>
-          <w:rtl w:val="0"/>
-        </w:rPr>
-      </w:r>
-    </w:p>
-    <w:p>
-      <w:pPr>
-        <w:rPr/>
-      </w:pPr>
-      <w:r>
-        <w:rPr>
-          <w:rtl w:val="0"/>
-        </w:rPr>
-        <w:t xml:space="preserve">A variable that exhibits similar differential tendencies, and should thus be grouped with the variables in A, will exhibit a picture where S1, S2 and S3 values are clearly at different levels, with individual points … .</w:t>
-      </w:r>
-    </w:p>
-    <w:p>
-      <w:pPr>
-        <w:rPr/>
-      </w:pPr>
-      <w:r>
-        <w:rPr>
-          <w:rtl w:val="0"/>
-        </w:rPr>
-      </w:r>
-    </w:p>
+    <w:p/>
     <w:sectPr>
-      <w:pgSz w:h="15840" w:w="12240" w:orient="portrait"/>
-      <w:pgMar w:bottom="1440" w:top="1440" w:left="1440" w:right="1440" w:header="720" w:footer="720"/>
+      <w:pgSz w:w="12240" w:h="15840"/>
+      <w:pgMar w:top="1440" w:right="1440" w:bottom="1440" w:left="1440" w:header="720" w:footer="720" w:gutter="0"/>
       <w:pgNumType w:start="1"/>
+      <w:cols w:space="720"/>
     </w:sectPr>
   </w:body>
 </w:document>
 </file>
 
-<file path=word/numbering.xml><?xml version="1.0" encoding="utf-8"?>
-<w:numbering xmlns:mc="http://schemas.openxmlformats.org/markup-compatibility/2006" xmlns:o="urn:schemas-microsoft-com:office:office" xmlns:r="http://schemas.openxmlformats.org/officeDocument/2006/relationships" xmlns:m="http://schemas.openxmlformats.org/officeDocument/2006/math" xmlns:v="urn:schemas-microsoft-com:vml" xmlns:wp="http://schemas.openxmlformats.org/drawingml/2006/wordprocessingDrawing" xmlns:w10="urn:schemas-microsoft-com:office:word" xmlns:w="http://schemas.openxmlformats.org/wordprocessingml/2006/main" xmlns:wne="http://schemas.microsoft.com/office/word/2006/wordml" xmlns:sl="http://schemas.openxmlformats.org/schemaLibrary/2006/main" xmlns:a="http://schemas.openxmlformats.org/drawingml/2006/main" xmlns:pic="http://schemas.openxmlformats.org/drawingml/2006/picture" xmlns:c="http://schemas.openxmlformats.org/drawingml/2006/chart" xmlns:lc="http://schemas.openxmlformats.org/drawingml/2006/lockedCanvas" xmlns:dgm="http://schemas.openxmlformats.org/drawingml/2006/diagram" xmlns:wps="http://schemas.microsoft.com/office/word/2010/wordprocessingShape" xmlns:wpg="http://schemas.microsoft.com/office/word/2010/wordprocessingGroup" xmlns:w14="http://schemas.microsoft.com/office/word/2010/wordml" xmlns:w15="http://schemas.microsoft.com/office/word/2012/wordml" xmlns:w16="http://schemas.microsoft.com/office/word/2018/wordml" xmlns:w16cex="http://schemas.microsoft.com/office/word/2018/wordml/cex" xmlns:w16cid="http://schemas.microsoft.com/office/word/2016/wordml/cid" xmlns="http://schemas.microsoft.com/office/tasks/2019/documenttasks" xmlns:cr="http://schemas.microsoft.com/office/comments/2020/reactions"/>
-</file>
-
 <file path=word/styles.xml><?xml version="1.0" encoding="utf-8"?>
-<w:styles xmlns:mc="http://schemas.openxmlformats.org/markup-compatibility/2006" xmlns:o="urn:schemas-microsoft-com:office:office" xmlns:r="http://schemas.openxmlformats.org/officeDocument/2006/relationships" xmlns:m="http://schemas.openxmlformats.org/officeDocument/2006/math" xmlns:v="urn:schemas-microsoft-com:vml" xmlns:wp="http://schemas.openxmlformats.org/drawingml/2006/wordprocessingDrawing" xmlns:w10="urn:schemas-microsoft-com:office:word" xmlns:w="http://schemas.openxmlformats.org/wordprocessingml/2006/main" xmlns:wne="http://schemas.microsoft.com/office/word/2006/wordml" xmlns:sl="http://schemas.openxmlformats.org/schemaLibrary/2006/main" xmlns:a="http://schemas.openxmlformats.org/drawingml/2006/main" xmlns:pic="http://schemas.openxmlformats.org/drawingml/2006/picture" xmlns:c="http://schemas.openxmlformats.org/drawingml/2006/chart" xmlns:lc="http://schemas.openxmlformats.org/drawingml/2006/lockedCanvas" xmlns:dgm="http://schemas.openxmlformats.org/drawingml/2006/diagram" xmlns:wps="http://schemas.microsoft.com/office/word/2010/wordprocessingShape" xmlns:wpg="http://schemas.microsoft.com/office/word/2010/wordprocessingGroup" xmlns:w14="http://schemas.microsoft.com/office/word/2010/wordml" xmlns:w15="http://schemas.microsoft.com/office/word/2012/wordml" xmlns:w16="http://schemas.microsoft.com/office/word/2018/wordml" xmlns:w16cex="http://schemas.microsoft.com/office/word/2018/wordml/cex" xmlns:w16cid="http://schemas.microsoft.com/office/word/2016/wordml/cid" xmlns="http://schemas.microsoft.com/office/tasks/2019/documenttasks" xmlns:cr="http://schemas.microsoft.com/office/comments/2020/reactions">
+<w:styles xmlns:mc="http://schemas.openxmlformats.org/markup-compatibility/2006" xmlns:r="http://schemas.openxmlformats.org/officeDocument/2006/relationships" xmlns:w="http://schemas.openxmlformats.org/wordprocessingml/2006/main" xmlns:w14="http://schemas.microsoft.com/office/word/2010/wordml" xmlns:w15="http://schemas.microsoft.com/office/word/2012/wordml" xmlns:w16cex="http://schemas.microsoft.com/office/word/2018/wordml/cex" xmlns:w16cid="http://schemas.microsoft.com/office/word/2016/wordml/cid" xmlns:w16="http://schemas.microsoft.com/office/word/2018/wordml" xmlns:w16du="http://schemas.microsoft.com/office/word/2023/wordml/word16du" xmlns:w16sdtdh="http://schemas.microsoft.com/office/word/2020/wordml/sdtdatahash" xmlns:w16sdtfl="http://schemas.microsoft.com/office/word/2024/wordml/sdtformatlock" xmlns:w16se="http://schemas.microsoft.com/office/word/2015/wordml/symex" mc:Ignorable="w14 w15 w16se w16cid w16 w16cex w16sdtdh w16sdtfl w16du">
   <w:docDefaults>
     <w:rPrDefault>
       <w:rPr>
-        <w:rFonts w:ascii="Arial" w:cs="Arial" w:eastAsia="Arial" w:hAnsi="Arial"/>
+        <w:rFonts w:ascii="Arial" w:eastAsia="Arial" w:hAnsi="Arial" w:cs="Arial"/>
         <w:sz w:val="22"/>
         <w:szCs w:val="22"/>
-        <w:lang w:val="en"/>
+        <w:lang w:val="en" w:eastAsia="en-US" w:bidi="ar-SA"/>
       </w:rPr>
     </w:rPrDefault>
     <w:pPrDefault>
@@ -265,29 +141,399 @@
       </w:pPr>
     </w:pPrDefault>
   </w:docDefaults>
-  <w:style w:type="table" w:styleId="TableNormal" w:default="1">
-    <w:name w:val="TableNormal"/>
-    <w:tblPr>
-      <w:tblCellMar>
-        <w:top w:w="100.0" w:type="dxa"/>
-        <w:left w:w="100.0" w:type="dxa"/>
-        <w:bottom w:w="100.0" w:type="dxa"/>
-        <w:right w:w="100.0" w:type="dxa"/>
-      </w:tblCellMar>
-    </w:tblPr>
-  </w:style>
-  <w:style w:type="paragraph" w:styleId="Normal" w:default="1">
-    <w:name w:val="normal"/>
+  <w:latentStyles w:defLockedState="0" w:defUIPriority="99" w:defSemiHidden="0" w:defUnhideWhenUsed="0" w:defQFormat="0" w:count="376">
+    <w:lsdException w:name="Normal" w:uiPriority="0" w:qFormat="1"/>
+    <w:lsdException w:name="heading 1" w:uiPriority="9" w:qFormat="1"/>
+    <w:lsdException w:name="heading 2" w:semiHidden="1" w:uiPriority="9" w:unhideWhenUsed="1" w:qFormat="1"/>
+    <w:lsdException w:name="heading 3" w:semiHidden="1" w:uiPriority="9" w:unhideWhenUsed="1" w:qFormat="1"/>
+    <w:lsdException w:name="heading 4" w:semiHidden="1" w:uiPriority="9" w:unhideWhenUsed="1" w:qFormat="1"/>
+    <w:lsdException w:name="heading 5" w:semiHidden="1" w:uiPriority="9" w:unhideWhenUsed="1" w:qFormat="1"/>
+    <w:lsdException w:name="heading 6" w:semiHidden="1" w:uiPriority="9" w:unhideWhenUsed="1" w:qFormat="1"/>
+    <w:lsdException w:name="heading 7" w:semiHidden="1" w:uiPriority="9" w:unhideWhenUsed="1" w:qFormat="1"/>
+    <w:lsdException w:name="heading 8" w:semiHidden="1" w:uiPriority="9" w:unhideWhenUsed="1" w:qFormat="1"/>
+    <w:lsdException w:name="heading 9" w:semiHidden="1" w:uiPriority="9" w:unhideWhenUsed="1" w:qFormat="1"/>
+    <w:lsdException w:name="index 1" w:semiHidden="1" w:unhideWhenUsed="1"/>
+    <w:lsdException w:name="index 2" w:semiHidden="1" w:unhideWhenUsed="1"/>
+    <w:lsdException w:name="index 3" w:semiHidden="1" w:unhideWhenUsed="1"/>
+    <w:lsdException w:name="index 4" w:semiHidden="1" w:unhideWhenUsed="1"/>
+    <w:lsdException w:name="index 5" w:semiHidden="1" w:unhideWhenUsed="1"/>
+    <w:lsdException w:name="index 6" w:semiHidden="1" w:unhideWhenUsed="1"/>
+    <w:lsdException w:name="index 7" w:semiHidden="1" w:unhideWhenUsed="1"/>
+    <w:lsdException w:name="index 8" w:semiHidden="1" w:unhideWhenUsed="1"/>
+    <w:lsdException w:name="index 9" w:semiHidden="1" w:unhideWhenUsed="1"/>
+    <w:lsdException w:name="toc 1" w:semiHidden="1" w:uiPriority="39" w:unhideWhenUsed="1"/>
+    <w:lsdException w:name="toc 2" w:semiHidden="1" w:uiPriority="39" w:unhideWhenUsed="1"/>
+    <w:lsdException w:name="toc 3" w:semiHidden="1" w:uiPriority="39" w:unhideWhenUsed="1"/>
+    <w:lsdException w:name="toc 4" w:semiHidden="1" w:uiPriority="39" w:unhideWhenUsed="1"/>
+    <w:lsdException w:name="toc 5" w:semiHidden="1" w:uiPriority="39" w:unhideWhenUsed="1"/>
+    <w:lsdException w:name="toc 6" w:semiHidden="1" w:uiPriority="39" w:unhideWhenUsed="1"/>
+    <w:lsdException w:name="toc 7" w:semiHidden="1" w:uiPriority="39" w:unhideWhenUsed="1"/>
+    <w:lsdException w:name="toc 8" w:semiHidden="1" w:uiPriority="39" w:unhideWhenUsed="1"/>
+    <w:lsdException w:name="toc 9" w:semiHidden="1" w:uiPriority="39" w:unhideWhenUsed="1"/>
+    <w:lsdException w:name="Normal Indent" w:semiHidden="1" w:unhideWhenUsed="1"/>
+    <w:lsdException w:name="footnote text" w:semiHidden="1" w:unhideWhenUsed="1"/>
+    <w:lsdException w:name="annotation text" w:semiHidden="1" w:unhideWhenUsed="1"/>
+    <w:lsdException w:name="header" w:semiHidden="1" w:unhideWhenUsed="1"/>
+    <w:lsdException w:name="footer" w:semiHidden="1" w:unhideWhenUsed="1"/>
+    <w:lsdException w:name="index heading" w:semiHidden="1" w:unhideWhenUsed="1"/>
+    <w:lsdException w:name="caption" w:semiHidden="1" w:uiPriority="35" w:unhideWhenUsed="1" w:qFormat="1"/>
+    <w:lsdException w:name="table of figures" w:semiHidden="1" w:unhideWhenUsed="1"/>
+    <w:lsdException w:name="envelope address" w:semiHidden="1" w:unhideWhenUsed="1"/>
+    <w:lsdException w:name="envelope return" w:semiHidden="1" w:unhideWhenUsed="1"/>
+    <w:lsdException w:name="footnote reference" w:semiHidden="1" w:unhideWhenUsed="1"/>
+    <w:lsdException w:name="annotation reference" w:semiHidden="1" w:unhideWhenUsed="1"/>
+    <w:lsdException w:name="line number" w:semiHidden="1" w:unhideWhenUsed="1"/>
+    <w:lsdException w:name="page number" w:semiHidden="1" w:unhideWhenUsed="1"/>
+    <w:lsdException w:name="endnote reference" w:semiHidden="1" w:unhideWhenUsed="1"/>
+    <w:lsdException w:name="endnote text" w:semiHidden="1" w:unhideWhenUsed="1"/>
+    <w:lsdException w:name="table of authorities" w:semiHidden="1" w:unhideWhenUsed="1"/>
+    <w:lsdException w:name="macro" w:semiHidden="1" w:unhideWhenUsed="1"/>
+    <w:lsdException w:name="toa heading" w:semiHidden="1" w:unhideWhenUsed="1"/>
+    <w:lsdException w:name="List" w:semiHidden="1" w:unhideWhenUsed="1"/>
+    <w:lsdException w:name="List Bullet" w:semiHidden="1" w:unhideWhenUsed="1"/>
+    <w:lsdException w:name="List Number" w:semiHidden="1" w:unhideWhenUsed="1"/>
+    <w:lsdException w:name="List 2" w:semiHidden="1" w:unhideWhenUsed="1"/>
+    <w:lsdException w:name="List 3" w:semiHidden="1" w:unhideWhenUsed="1"/>
+    <w:lsdException w:name="List 4" w:semiHidden="1" w:unhideWhenUsed="1"/>
+    <w:lsdException w:name="List 5" w:semiHidden="1" w:unhideWhenUsed="1"/>
+    <w:lsdException w:name="List Bullet 2" w:semiHidden="1" w:unhideWhenUsed="1"/>
+    <w:lsdException w:name="List Bullet 3" w:semiHidden="1" w:unhideWhenUsed="1"/>
+    <w:lsdException w:name="List Bullet 4" w:semiHidden="1" w:unhideWhenUsed="1"/>
+    <w:lsdException w:name="List Bullet 5" w:semiHidden="1" w:unhideWhenUsed="1"/>
+    <w:lsdException w:name="List Number 2" w:semiHidden="1" w:unhideWhenUsed="1"/>
+    <w:lsdException w:name="List Number 3" w:semiHidden="1" w:unhideWhenUsed="1"/>
+    <w:lsdException w:name="List Number 4" w:semiHidden="1" w:unhideWhenUsed="1"/>
+    <w:lsdException w:name="List Number 5" w:semiHidden="1" w:unhideWhenUsed="1"/>
+    <w:lsdException w:name="Title" w:uiPriority="10" w:qFormat="1"/>
+    <w:lsdException w:name="Closing" w:semiHidden="1" w:unhideWhenUsed="1"/>
+    <w:lsdException w:name="Signature" w:semiHidden="1" w:unhideWhenUsed="1"/>
+    <w:lsdException w:name="Default Paragraph Font" w:semiHidden="1" w:uiPriority="1" w:unhideWhenUsed="1"/>
+    <w:lsdException w:name="Body Text" w:semiHidden="1" w:unhideWhenUsed="1"/>
+    <w:lsdException w:name="Body Text Indent" w:semiHidden="1" w:unhideWhenUsed="1"/>
+    <w:lsdException w:name="List Continue" w:semiHidden="1" w:unhideWhenUsed="1"/>
+    <w:lsdException w:name="List Continue 2" w:semiHidden="1" w:unhideWhenUsed="1"/>
+    <w:lsdException w:name="List Continue 3" w:semiHidden="1" w:unhideWhenUsed="1"/>
+    <w:lsdException w:name="List Continue 4" w:semiHidden="1" w:unhideWhenUsed="1"/>
+    <w:lsdException w:name="List Continue 5" w:semiHidden="1" w:unhideWhenUsed="1"/>
+    <w:lsdException w:name="Message Header" w:semiHidden="1" w:unhideWhenUsed="1"/>
+    <w:lsdException w:name="Subtitle" w:uiPriority="11" w:qFormat="1"/>
+    <w:lsdException w:name="Salutation" w:semiHidden="1" w:unhideWhenUsed="1"/>
+    <w:lsdException w:name="Date" w:semiHidden="1" w:unhideWhenUsed="1"/>
+    <w:lsdException w:name="Body Text First Indent" w:semiHidden="1" w:unhideWhenUsed="1"/>
+    <w:lsdException w:name="Body Text First Indent 2" w:semiHidden="1" w:unhideWhenUsed="1"/>
+    <w:lsdException w:name="Note Heading" w:semiHidden="1" w:unhideWhenUsed="1"/>
+    <w:lsdException w:name="Body Text 2" w:semiHidden="1" w:unhideWhenUsed="1"/>
+    <w:lsdException w:name="Body Text 3" w:semiHidden="1" w:unhideWhenUsed="1"/>
+    <w:lsdException w:name="Body Text Indent 2" w:semiHidden="1" w:unhideWhenUsed="1"/>
+    <w:lsdException w:name="Body Text Indent 3" w:semiHidden="1" w:unhideWhenUsed="1"/>
+    <w:lsdException w:name="Block Text" w:semiHidden="1" w:unhideWhenUsed="1"/>
+    <w:lsdException w:name="Hyperlink" w:semiHidden="1" w:unhideWhenUsed="1"/>
+    <w:lsdException w:name="FollowedHyperlink" w:semiHidden="1" w:unhideWhenUsed="1"/>
+    <w:lsdException w:name="Strong" w:uiPriority="22" w:qFormat="1"/>
+    <w:lsdException w:name="Emphasis" w:uiPriority="20" w:qFormat="1"/>
+    <w:lsdException w:name="Document Map" w:semiHidden="1" w:unhideWhenUsed="1"/>
+    <w:lsdException w:name="Plain Text" w:semiHidden="1" w:unhideWhenUsed="1"/>
+    <w:lsdException w:name="E-mail Signature" w:semiHidden="1" w:unhideWhenUsed="1"/>
+    <w:lsdException w:name="HTML Top of Form" w:semiHidden="1" w:unhideWhenUsed="1"/>
+    <w:lsdException w:name="HTML Bottom of Form" w:semiHidden="1" w:unhideWhenUsed="1"/>
+    <w:lsdException w:name="Normal (Web)" w:semiHidden="1" w:unhideWhenUsed="1"/>
+    <w:lsdException w:name="HTML Acronym" w:semiHidden="1" w:unhideWhenUsed="1"/>
+    <w:lsdException w:name="HTML Address" w:semiHidden="1" w:unhideWhenUsed="1"/>
+    <w:lsdException w:name="HTML Cite" w:semiHidden="1" w:unhideWhenUsed="1"/>
+    <w:lsdException w:name="HTML Code" w:semiHidden="1" w:unhideWhenUsed="1"/>
+    <w:lsdException w:name="HTML Definition" w:semiHidden="1" w:unhideWhenUsed="1"/>
+    <w:lsdException w:name="HTML Keyboard" w:semiHidden="1" w:unhideWhenUsed="1"/>
+    <w:lsdException w:name="HTML Preformatted" w:semiHidden="1" w:unhideWhenUsed="1"/>
+    <w:lsdException w:name="HTML Sample" w:semiHidden="1" w:unhideWhenUsed="1"/>
+    <w:lsdException w:name="HTML Typewriter" w:semiHidden="1" w:unhideWhenUsed="1"/>
+    <w:lsdException w:name="HTML Variable" w:semiHidden="1" w:unhideWhenUsed="1"/>
+    <w:lsdException w:name="Normal Table" w:semiHidden="1" w:unhideWhenUsed="1"/>
+    <w:lsdException w:name="annotation subject" w:semiHidden="1" w:unhideWhenUsed="1"/>
+    <w:lsdException w:name="No List" w:semiHidden="1" w:unhideWhenUsed="1"/>
+    <w:lsdException w:name="Outline List 1" w:semiHidden="1" w:unhideWhenUsed="1"/>
+    <w:lsdException w:name="Outline List 2" w:semiHidden="1" w:unhideWhenUsed="1"/>
+    <w:lsdException w:name="Outline List 3" w:semiHidden="1" w:unhideWhenUsed="1"/>
+    <w:lsdException w:name="Table Simple 1" w:semiHidden="1" w:unhideWhenUsed="1"/>
+    <w:lsdException w:name="Table Simple 2" w:semiHidden="1" w:unhideWhenUsed="1"/>
+    <w:lsdException w:name="Table Simple 3" w:semiHidden="1" w:unhideWhenUsed="1"/>
+    <w:lsdException w:name="Table Classic 1" w:semiHidden="1" w:unhideWhenUsed="1"/>
+    <w:lsdException w:name="Table Classic 2" w:semiHidden="1" w:unhideWhenUsed="1"/>
+    <w:lsdException w:name="Table Classic 3" w:semiHidden="1" w:unhideWhenUsed="1"/>
+    <w:lsdException w:name="Table Classic 4" w:semiHidden="1" w:unhideWhenUsed="1"/>
+    <w:lsdException w:name="Table Colorful 1" w:semiHidden="1" w:unhideWhenUsed="1"/>
+    <w:lsdException w:name="Table Colorful 2" w:semiHidden="1" w:unhideWhenUsed="1"/>
+    <w:lsdException w:name="Table Colorful 3" w:semiHidden="1" w:unhideWhenUsed="1"/>
+    <w:lsdException w:name="Table Columns 1" w:semiHidden="1" w:unhideWhenUsed="1"/>
+    <w:lsdException w:name="Table Columns 2" w:semiHidden="1" w:unhideWhenUsed="1"/>
+    <w:lsdException w:name="Table Columns 3" w:semiHidden="1" w:unhideWhenUsed="1"/>
+    <w:lsdException w:name="Table Columns 4" w:semiHidden="1" w:unhideWhenUsed="1"/>
+    <w:lsdException w:name="Table Columns 5" w:semiHidden="1" w:unhideWhenUsed="1"/>
+    <w:lsdException w:name="Table Grid 1" w:semiHidden="1" w:unhideWhenUsed="1"/>
+    <w:lsdException w:name="Table Grid 2" w:semiHidden="1" w:unhideWhenUsed="1"/>
+    <w:lsdException w:name="Table Grid 3" w:semiHidden="1" w:unhideWhenUsed="1"/>
+    <w:lsdException w:name="Table Grid 4" w:semiHidden="1" w:unhideWhenUsed="1"/>
+    <w:lsdException w:name="Table Grid 5" w:semiHidden="1" w:unhideWhenUsed="1"/>
+    <w:lsdException w:name="Table Grid 6" w:semiHidden="1" w:unhideWhenUsed="1"/>
+    <w:lsdException w:name="Table Grid 7" w:semiHidden="1" w:unhideWhenUsed="1"/>
+    <w:lsdException w:name="Table Grid 8" w:semiHidden="1" w:unhideWhenUsed="1"/>
+    <w:lsdException w:name="Table List 1" w:semiHidden="1" w:unhideWhenUsed="1"/>
+    <w:lsdException w:name="Table List 2" w:semiHidden="1" w:unhideWhenUsed="1"/>
+    <w:lsdException w:name="Table List 3" w:semiHidden="1" w:unhideWhenUsed="1"/>
+    <w:lsdException w:name="Table List 4" w:semiHidden="1" w:unhideWhenUsed="1"/>
+    <w:lsdException w:name="Table List 5" w:semiHidden="1" w:unhideWhenUsed="1"/>
+    <w:lsdException w:name="Table List 6" w:semiHidden="1" w:unhideWhenUsed="1"/>
+    <w:lsdException w:name="Table List 7" w:semiHidden="1" w:unhideWhenUsed="1"/>
+    <w:lsdException w:name="Table List 8" w:semiHidden="1" w:unhideWhenUsed="1"/>
+    <w:lsdException w:name="Table 3D effects 1" w:semiHidden="1" w:unhideWhenUsed="1"/>
+    <w:lsdException w:name="Table 3D effects 2" w:semiHidden="1" w:unhideWhenUsed="1"/>
+    <w:lsdException w:name="Table 3D effects 3" w:semiHidden="1" w:unhideWhenUsed="1"/>
+    <w:lsdException w:name="Table Contemporary" w:semiHidden="1" w:unhideWhenUsed="1"/>
+    <w:lsdException w:name="Table Elegant" w:semiHidden="1" w:unhideWhenUsed="1"/>
+    <w:lsdException w:name="Table Professional" w:semiHidden="1" w:unhideWhenUsed="1"/>
+    <w:lsdException w:name="Table Subtle 1" w:semiHidden="1" w:unhideWhenUsed="1"/>
+    <w:lsdException w:name="Table Subtle 2" w:semiHidden="1" w:unhideWhenUsed="1"/>
+    <w:lsdException w:name="Table Web 1" w:semiHidden="1" w:unhideWhenUsed="1"/>
+    <w:lsdException w:name="Table Web 2" w:semiHidden="1" w:unhideWhenUsed="1"/>
+    <w:lsdException w:name="Table Web 3" w:semiHidden="1" w:unhideWhenUsed="1"/>
+    <w:lsdException w:name="Balloon Text" w:semiHidden="1" w:unhideWhenUsed="1"/>
+    <w:lsdException w:name="Table Grid" w:uiPriority="39"/>
+    <w:lsdException w:name="Table Theme" w:semiHidden="1" w:unhideWhenUsed="1"/>
+    <w:lsdException w:name="Placeholder Text" w:semiHidden="1"/>
+    <w:lsdException w:name="No Spacing" w:uiPriority="1" w:qFormat="1"/>
+    <w:lsdException w:name="Light Shading" w:uiPriority="60"/>
+    <w:lsdException w:name="Light List" w:uiPriority="61"/>
+    <w:lsdException w:name="Light Grid" w:uiPriority="62"/>
+    <w:lsdException w:name="Medium Shading 1" w:uiPriority="63"/>
+    <w:lsdException w:name="Medium Shading 2" w:uiPriority="64"/>
+    <w:lsdException w:name="Medium List 1" w:uiPriority="65"/>
+    <w:lsdException w:name="Medium List 2" w:uiPriority="66"/>
+    <w:lsdException w:name="Medium Grid 1" w:uiPriority="67"/>
+    <w:lsdException w:name="Medium Grid 2" w:uiPriority="68"/>
+    <w:lsdException w:name="Medium Grid 3" w:uiPriority="69"/>
+    <w:lsdException w:name="Dark List" w:uiPriority="70"/>
+    <w:lsdException w:name="Colorful Shading" w:uiPriority="71"/>
+    <w:lsdException w:name="Colorful List" w:uiPriority="72"/>
+    <w:lsdException w:name="Colorful Grid" w:uiPriority="73"/>
+    <w:lsdException w:name="Light Shading Accent 1" w:uiPriority="60"/>
+    <w:lsdException w:name="Light List Accent 1" w:uiPriority="61"/>
+    <w:lsdException w:name="Light Grid Accent 1" w:uiPriority="62"/>
+    <w:lsdException w:name="Medium Shading 1 Accent 1" w:uiPriority="63"/>
+    <w:lsdException w:name="Medium Shading 2 Accent 1" w:uiPriority="64"/>
+    <w:lsdException w:name="Medium List 1 Accent 1" w:uiPriority="65"/>
+    <w:lsdException w:name="Revision" w:semiHidden="1"/>
+    <w:lsdException w:name="List Paragraph" w:uiPriority="34" w:qFormat="1"/>
+    <w:lsdException w:name="Quote" w:uiPriority="29" w:qFormat="1"/>
+    <w:lsdException w:name="Intense Quote" w:uiPriority="30" w:qFormat="1"/>
+    <w:lsdException w:name="Medium List 2 Accent 1" w:uiPriority="66"/>
+    <w:lsdException w:name="Medium Grid 1 Accent 1" w:uiPriority="67"/>
+    <w:lsdException w:name="Medium Grid 2 Accent 1" w:uiPriority="68"/>
+    <w:lsdException w:name="Medium Grid 3 Accent 1" w:uiPriority="69"/>
+    <w:lsdException w:name="Dark List Accent 1" w:uiPriority="70"/>
+    <w:lsdException w:name="Colorful Shading Accent 1" w:uiPriority="71"/>
+    <w:lsdException w:name="Colorful List Accent 1" w:uiPriority="72"/>
+    <w:lsdException w:name="Colorful Grid Accent 1" w:uiPriority="73"/>
+    <w:lsdException w:name="Light Shading Accent 2" w:uiPriority="60"/>
+    <w:lsdException w:name="Light List Accent 2" w:uiPriority="61"/>
+    <w:lsdException w:name="Light Grid Accent 2" w:uiPriority="62"/>
+    <w:lsdException w:name="Medium Shading 1 Accent 2" w:uiPriority="63"/>
+    <w:lsdException w:name="Medium Shading 2 Accent 2" w:uiPriority="64"/>
+    <w:lsdException w:name="Medium List 1 Accent 2" w:uiPriority="65"/>
+    <w:lsdException w:name="Medium List 2 Accent 2" w:uiPriority="66"/>
+    <w:lsdException w:name="Medium Grid 1 Accent 2" w:uiPriority="67"/>
+    <w:lsdException w:name="Medium Grid 2 Accent 2" w:uiPriority="68"/>
+    <w:lsdException w:name="Medium Grid 3 Accent 2" w:uiPriority="69"/>
+    <w:lsdException w:name="Dark List Accent 2" w:uiPriority="70"/>
+    <w:lsdException w:name="Colorful Shading Accent 2" w:uiPriority="71"/>
+    <w:lsdException w:name="Colorful List Accent 2" w:uiPriority="72"/>
+    <w:lsdException w:name="Colorful Grid Accent 2" w:uiPriority="73"/>
+    <w:lsdException w:name="Light Shading Accent 3" w:uiPriority="60"/>
+    <w:lsdException w:name="Light List Accent 3" w:uiPriority="61"/>
+    <w:lsdException w:name="Light Grid Accent 3" w:uiPriority="62"/>
+    <w:lsdException w:name="Medium Shading 1 Accent 3" w:uiPriority="63"/>
+    <w:lsdException w:name="Medium Shading 2 Accent 3" w:uiPriority="64"/>
+    <w:lsdException w:name="Medium List 1 Accent 3" w:uiPriority="65"/>
+    <w:lsdException w:name="Medium List 2 Accent 3" w:uiPriority="66"/>
+    <w:lsdException w:name="Medium Grid 1 Accent 3" w:uiPriority="67"/>
+    <w:lsdException w:name="Medium Grid 2 Accent 3" w:uiPriority="68"/>
+    <w:lsdException w:name="Medium Grid 3 Accent 3" w:uiPriority="69"/>
+    <w:lsdException w:name="Dark List Accent 3" w:uiPriority="70"/>
+    <w:lsdException w:name="Colorful Shading Accent 3" w:uiPriority="71"/>
+    <w:lsdException w:name="Colorful List Accent 3" w:uiPriority="72"/>
+    <w:lsdException w:name="Colorful Grid Accent 3" w:uiPriority="73"/>
+    <w:lsdException w:name="Light Shading Accent 4" w:uiPriority="60"/>
+    <w:lsdException w:name="Light List Accent 4" w:uiPriority="61"/>
+    <w:lsdException w:name="Light Grid Accent 4" w:uiPriority="62"/>
+    <w:lsdException w:name="Medium Shading 1 Accent 4" w:uiPriority="63"/>
+    <w:lsdException w:name="Medium Shading 2 Accent 4" w:uiPriority="64"/>
+    <w:lsdException w:name="Medium List 1 Accent 4" w:uiPriority="65"/>
+    <w:lsdException w:name="Medium List 2 Accent 4" w:uiPriority="66"/>
+    <w:lsdException w:name="Medium Grid 1 Accent 4" w:uiPriority="67"/>
+    <w:lsdException w:name="Medium Grid 2 Accent 4" w:uiPriority="68"/>
+    <w:lsdException w:name="Medium Grid 3 Accent 4" w:uiPriority="69"/>
+    <w:lsdException w:name="Dark List Accent 4" w:uiPriority="70"/>
+    <w:lsdException w:name="Colorful Shading Accent 4" w:uiPriority="71"/>
+    <w:lsdException w:name="Colorful List Accent 4" w:uiPriority="72"/>
+    <w:lsdException w:name="Colorful Grid Accent 4" w:uiPriority="73"/>
+    <w:lsdException w:name="Light Shading Accent 5" w:uiPriority="60"/>
+    <w:lsdException w:name="Light List Accent 5" w:uiPriority="61"/>
+    <w:lsdException w:name="Light Grid Accent 5" w:uiPriority="62"/>
+    <w:lsdException w:name="Medium Shading 1 Accent 5" w:uiPriority="63"/>
+    <w:lsdException w:name="Medium Shading 2 Accent 5" w:uiPriority="64"/>
+    <w:lsdException w:name="Medium List 1 Accent 5" w:uiPriority="65"/>
+    <w:lsdException w:name="Medium List 2 Accent 5" w:uiPriority="66"/>
+    <w:lsdException w:name="Medium Grid 1 Accent 5" w:uiPriority="67"/>
+    <w:lsdException w:name="Medium Grid 2 Accent 5" w:uiPriority="68"/>
+    <w:lsdException w:name="Medium Grid 3 Accent 5" w:uiPriority="69"/>
+    <w:lsdException w:name="Dark List Accent 5" w:uiPriority="70"/>
+    <w:lsdException w:name="Colorful Shading Accent 5" w:uiPriority="71"/>
+    <w:lsdException w:name="Colorful List Accent 5" w:uiPriority="72"/>
+    <w:lsdException w:name="Colorful Grid Accent 5" w:uiPriority="73"/>
+    <w:lsdException w:name="Light Shading Accent 6" w:uiPriority="60"/>
+    <w:lsdException w:name="Light List Accent 6" w:uiPriority="61"/>
+    <w:lsdException w:name="Light Grid Accent 6" w:uiPriority="62"/>
+    <w:lsdException w:name="Medium Shading 1 Accent 6" w:uiPriority="63"/>
+    <w:lsdException w:name="Medium Shading 2 Accent 6" w:uiPriority="64"/>
+    <w:lsdException w:name="Medium List 1 Accent 6" w:uiPriority="65"/>
+    <w:lsdException w:name="Medium List 2 Accent 6" w:uiPriority="66"/>
+    <w:lsdException w:name="Medium Grid 1 Accent 6" w:uiPriority="67"/>
+    <w:lsdException w:name="Medium Grid 2 Accent 6" w:uiPriority="68"/>
+    <w:lsdException w:name="Medium Grid 3 Accent 6" w:uiPriority="69"/>
+    <w:lsdException w:name="Dark List Accent 6" w:uiPriority="70"/>
+    <w:lsdException w:name="Colorful Shading Accent 6" w:uiPriority="71"/>
+    <w:lsdException w:name="Colorful List Accent 6" w:uiPriority="72"/>
+    <w:lsdException w:name="Colorful Grid Accent 6" w:uiPriority="73"/>
+    <w:lsdException w:name="Subtle Emphasis" w:uiPriority="19" w:qFormat="1"/>
+    <w:lsdException w:name="Intense Emphasis" w:uiPriority="21" w:qFormat="1"/>
+    <w:lsdException w:name="Subtle Reference" w:uiPriority="31" w:qFormat="1"/>
+    <w:lsdException w:name="Intense Reference" w:uiPriority="32" w:qFormat="1"/>
+    <w:lsdException w:name="Book Title" w:uiPriority="33" w:qFormat="1"/>
+    <w:lsdException w:name="Bibliography" w:semiHidden="1" w:uiPriority="37" w:unhideWhenUsed="1"/>
+    <w:lsdException w:name="TOC Heading" w:semiHidden="1" w:uiPriority="39" w:unhideWhenUsed="1" w:qFormat="1"/>
+    <w:lsdException w:name="Plain Table 1" w:uiPriority="41"/>
+    <w:lsdException w:name="Plain Table 2" w:uiPriority="42"/>
+    <w:lsdException w:name="Plain Table 3" w:uiPriority="43"/>
+    <w:lsdException w:name="Plain Table 4" w:uiPriority="44"/>
+    <w:lsdException w:name="Plain Table 5" w:uiPriority="45"/>
+    <w:lsdException w:name="Grid Table Light" w:uiPriority="40"/>
+    <w:lsdException w:name="Grid Table 1 Light" w:uiPriority="46"/>
+    <w:lsdException w:name="Grid Table 2" w:uiPriority="47"/>
+    <w:lsdException w:name="Grid Table 3" w:uiPriority="48"/>
+    <w:lsdException w:name="Grid Table 4" w:uiPriority="49"/>
+    <w:lsdException w:name="Grid Table 5 Dark" w:uiPriority="50"/>
+    <w:lsdException w:name="Grid Table 6 Colorful" w:uiPriority="51"/>
+    <w:lsdException w:name="Grid Table 7 Colorful" w:uiPriority="52"/>
+    <w:lsdException w:name="Grid Table 1 Light Accent 1" w:uiPriority="46"/>
+    <w:lsdException w:name="Grid Table 2 Accent 1" w:uiPriority="47"/>
+    <w:lsdException w:name="Grid Table 3 Accent 1" w:uiPriority="48"/>
+    <w:lsdException w:name="Grid Table 4 Accent 1" w:uiPriority="49"/>
+    <w:lsdException w:name="Grid Table 5 Dark Accent 1" w:uiPriority="50"/>
+    <w:lsdException w:name="Grid Table 6 Colorful Accent 1" w:uiPriority="51"/>
+    <w:lsdException w:name="Grid Table 7 Colorful Accent 1" w:uiPriority="52"/>
+    <w:lsdException w:name="Grid Table 1 Light Accent 2" w:uiPriority="46"/>
+    <w:lsdException w:name="Grid Table 2 Accent 2" w:uiPriority="47"/>
+    <w:lsdException w:name="Grid Table 3 Accent 2" w:uiPriority="48"/>
+    <w:lsdException w:name="Grid Table 4 Accent 2" w:uiPriority="49"/>
+    <w:lsdException w:name="Grid Table 5 Dark Accent 2" w:uiPriority="50"/>
+    <w:lsdException w:name="Grid Table 6 Colorful Accent 2" w:uiPriority="51"/>
+    <w:lsdException w:name="Grid Table 7 Colorful Accent 2" w:uiPriority="52"/>
+    <w:lsdException w:name="Grid Table 1 Light Accent 3" w:uiPriority="46"/>
+    <w:lsdException w:name="Grid Table 2 Accent 3" w:uiPriority="47"/>
+    <w:lsdException w:name="Grid Table 3 Accent 3" w:uiPriority="48"/>
+    <w:lsdException w:name="Grid Table 4 Accent 3" w:uiPriority="49"/>
+    <w:lsdException w:name="Grid Table 5 Dark Accent 3" w:uiPriority="50"/>
+    <w:lsdException w:name="Grid Table 6 Colorful Accent 3" w:uiPriority="51"/>
+    <w:lsdException w:name="Grid Table 7 Colorful Accent 3" w:uiPriority="52"/>
+    <w:lsdException w:name="Grid Table 1 Light Accent 4" w:uiPriority="46"/>
+    <w:lsdException w:name="Grid Table 2 Accent 4" w:uiPriority="47"/>
+    <w:lsdException w:name="Grid Table 3 Accent 4" w:uiPriority="48"/>
+    <w:lsdException w:name="Grid Table 4 Accent 4" w:uiPriority="49"/>
+    <w:lsdException w:name="Grid Table 5 Dark Accent 4" w:uiPriority="50"/>
+    <w:lsdException w:name="Grid Table 6 Colorful Accent 4" w:uiPriority="51"/>
+    <w:lsdException w:name="Grid Table 7 Colorful Accent 4" w:uiPriority="52"/>
+    <w:lsdException w:name="Grid Table 1 Light Accent 5" w:uiPriority="46"/>
+    <w:lsdException w:name="Grid Table 2 Accent 5" w:uiPriority="47"/>
+    <w:lsdException w:name="Grid Table 3 Accent 5" w:uiPriority="48"/>
+    <w:lsdException w:name="Grid Table 4 Accent 5" w:uiPriority="49"/>
+    <w:lsdException w:name="Grid Table 5 Dark Accent 5" w:uiPriority="50"/>
+    <w:lsdException w:name="Grid Table 6 Colorful Accent 5" w:uiPriority="51"/>
+    <w:lsdException w:name="Grid Table 7 Colorful Accent 5" w:uiPriority="52"/>
+    <w:lsdException w:name="Grid Table 1 Light Accent 6" w:uiPriority="46"/>
+    <w:lsdException w:name="Grid Table 2 Accent 6" w:uiPriority="47"/>
+    <w:lsdException w:name="Grid Table 3 Accent 6" w:uiPriority="48"/>
+    <w:lsdException w:name="Grid Table 4 Accent 6" w:uiPriority="49"/>
+    <w:lsdException w:name="Grid Table 5 Dark Accent 6" w:uiPriority="50"/>
+    <w:lsdException w:name="Grid Table 6 Colorful Accent 6" w:uiPriority="51"/>
+    <w:lsdException w:name="Grid Table 7 Colorful Accent 6" w:uiPriority="52"/>
+    <w:lsdException w:name="List Table 1 Light" w:uiPriority="46"/>
+    <w:lsdException w:name="List Table 2" w:uiPriority="47"/>
+    <w:lsdException w:name="List Table 3" w:uiPriority="48"/>
+    <w:lsdException w:name="List Table 4" w:uiPriority="49"/>
+    <w:lsdException w:name="List Table 5 Dark" w:uiPriority="50"/>
+    <w:lsdException w:name="List Table 6 Colorful" w:uiPriority="51"/>
+    <w:lsdException w:name="List Table 7 Colorful" w:uiPriority="52"/>
+    <w:lsdException w:name="List Table 1 Light Accent 1" w:uiPriority="46"/>
+    <w:lsdException w:name="List Table 2 Accent 1" w:uiPriority="47"/>
+    <w:lsdException w:name="List Table 3 Accent 1" w:uiPriority="48"/>
+    <w:lsdException w:name="List Table 4 Accent 1" w:uiPriority="49"/>
+    <w:lsdException w:name="List Table 5 Dark Accent 1" w:uiPriority="50"/>
+    <w:lsdException w:name="List Table 6 Colorful Accent 1" w:uiPriority="51"/>
+    <w:lsdException w:name="List Table 7 Colorful Accent 1" w:uiPriority="52"/>
+    <w:lsdException w:name="List Table 1 Light Accent 2" w:uiPriority="46"/>
+    <w:lsdException w:name="List Table 2 Accent 2" w:uiPriority="47"/>
+    <w:lsdException w:name="List Table 3 Accent 2" w:uiPriority="48"/>
+    <w:lsdException w:name="List Table 4 Accent 2" w:uiPriority="49"/>
+    <w:lsdException w:name="List Table 5 Dark Accent 2" w:uiPriority="50"/>
+    <w:lsdException w:name="List Table 6 Colorful Accent 2" w:uiPriority="51"/>
+    <w:lsdException w:name="List Table 7 Colorful Accent 2" w:uiPriority="52"/>
+    <w:lsdException w:name="List Table 1 Light Accent 3" w:uiPriority="46"/>
+    <w:lsdException w:name="List Table 2 Accent 3" w:uiPriority="47"/>
+    <w:lsdException w:name="List Table 3 Accent 3" w:uiPriority="48"/>
+    <w:lsdException w:name="List Table 4 Accent 3" w:uiPriority="49"/>
+    <w:lsdException w:name="List Table 5 Dark Accent 3" w:uiPriority="50"/>
+    <w:lsdException w:name="List Table 6 Colorful Accent 3" w:uiPriority="51"/>
+    <w:lsdException w:name="List Table 7 Colorful Accent 3" w:uiPriority="52"/>
+    <w:lsdException w:name="List Table 1 Light Accent 4" w:uiPriority="46"/>
+    <w:lsdException w:name="List Table 2 Accent 4" w:uiPriority="47"/>
+    <w:lsdException w:name="List Table 3 Accent 4" w:uiPriority="48"/>
+    <w:lsdException w:name="List Table 4 Accent 4" w:uiPriority="49"/>
+    <w:lsdException w:name="List Table 5 Dark Accent 4" w:uiPriority="50"/>
+    <w:lsdException w:name="List Table 6 Colorful Accent 4" w:uiPriority="51"/>
+    <w:lsdException w:name="List Table 7 Colorful Accent 4" w:uiPriority="52"/>
+    <w:lsdException w:name="List Table 1 Light Accent 5" w:uiPriority="46"/>
+    <w:lsdException w:name="List Table 2 Accent 5" w:uiPriority="47"/>
+    <w:lsdException w:name="List Table 3 Accent 5" w:uiPriority="48"/>
+    <w:lsdException w:name="List Table 4 Accent 5" w:uiPriority="49"/>
+    <w:lsdException w:name="List Table 5 Dark Accent 5" w:uiPriority="50"/>
+    <w:lsdException w:name="List Table 6 Colorful Accent 5" w:uiPriority="51"/>
+    <w:lsdException w:name="List Table 7 Colorful Accent 5" w:uiPriority="52"/>
+    <w:lsdException w:name="List Table 1 Light Accent 6" w:uiPriority="46"/>
+    <w:lsdException w:name="List Table 2 Accent 6" w:uiPriority="47"/>
+    <w:lsdException w:name="List Table 3 Accent 6" w:uiPriority="48"/>
+    <w:lsdException w:name="List Table 4 Accent 6" w:uiPriority="49"/>
+    <w:lsdException w:name="List Table 5 Dark Accent 6" w:uiPriority="50"/>
+    <w:lsdException w:name="List Table 6 Colorful Accent 6" w:uiPriority="51"/>
+    <w:lsdException w:name="List Table 7 Colorful Accent 6" w:uiPriority="52"/>
+    <w:lsdException w:name="Mention" w:semiHidden="1" w:unhideWhenUsed="1"/>
+    <w:lsdException w:name="Smart Hyperlink" w:semiHidden="1" w:unhideWhenUsed="1"/>
+    <w:lsdException w:name="Hashtag" w:semiHidden="1" w:unhideWhenUsed="1"/>
+    <w:lsdException w:name="Unresolved Mention" w:semiHidden="1" w:unhideWhenUsed="1"/>
+    <w:lsdException w:name="Smart Link" w:semiHidden="1" w:unhideWhenUsed="1"/>
+  </w:latentStyles>
+  <w:style w:type="paragraph" w:default="1" w:styleId="Normal">
+    <w:name w:val="Normal"/>
+    <w:qFormat/>
   </w:style>
   <w:style w:type="paragraph" w:styleId="Heading1">
     <w:name w:val="heading 1"/>
     <w:basedOn w:val="Normal"/>
     <w:next w:val="Normal"/>
+    <w:uiPriority w:val="9"/>
+    <w:qFormat/>
     <w:pPr>
-      <w:keepNext w:val="1"/>
-      <w:keepLines w:val="1"/>
-      <w:pageBreakBefore w:val="0"/>
-      <w:spacing w:after="120" w:before="400" w:lineRule="auto"/>
+      <w:keepNext/>
+      <w:keepLines/>
+      <w:spacing w:before="400" w:after="120"/>
+      <w:outlineLvl w:val="0"/>
     </w:pPr>
     <w:rPr>
       <w:sz w:val="40"/>
@@ -298,15 +544,17 @@
     <w:name w:val="heading 2"/>
     <w:basedOn w:val="Normal"/>
     <w:next w:val="Normal"/>
+    <w:uiPriority w:val="9"/>
+    <w:semiHidden/>
+    <w:unhideWhenUsed/>
+    <w:qFormat/>
     <w:pPr>
-      <w:keepNext w:val="1"/>
-      <w:keepLines w:val="1"/>
-      <w:pageBreakBefore w:val="0"/>
-      <w:spacing w:after="120" w:before="360" w:lineRule="auto"/>
+      <w:keepNext/>
+      <w:keepLines/>
+      <w:spacing w:before="360" w:after="120"/>
+      <w:outlineLvl w:val="1"/>
     </w:pPr>
     <w:rPr>
-      <w:b w:val="0"/>
-      <w:bCs w:val="0"/>
       <w:sz w:val="32"/>
       <w:szCs w:val="32"/>
     </w:rPr>
@@ -315,15 +563,17 @@
     <w:name w:val="heading 3"/>
     <w:basedOn w:val="Normal"/>
     <w:next w:val="Normal"/>
+    <w:uiPriority w:val="9"/>
+    <w:semiHidden/>
+    <w:unhideWhenUsed/>
+    <w:qFormat/>
     <w:pPr>
-      <w:keepNext w:val="1"/>
-      <w:keepLines w:val="1"/>
-      <w:pageBreakBefore w:val="0"/>
-      <w:spacing w:after="80" w:before="320" w:lineRule="auto"/>
+      <w:keepNext/>
+      <w:keepLines/>
+      <w:spacing w:before="320" w:after="80"/>
+      <w:outlineLvl w:val="2"/>
     </w:pPr>
     <w:rPr>
-      <w:b w:val="0"/>
-      <w:bCs w:val="0"/>
       <w:color w:val="434343"/>
       <w:sz w:val="28"/>
       <w:szCs w:val="28"/>
@@ -333,11 +583,15 @@
     <w:name w:val="heading 4"/>
     <w:basedOn w:val="Normal"/>
     <w:next w:val="Normal"/>
+    <w:uiPriority w:val="9"/>
+    <w:semiHidden/>
+    <w:unhideWhenUsed/>
+    <w:qFormat/>
     <w:pPr>
-      <w:keepNext w:val="1"/>
-      <w:keepLines w:val="1"/>
-      <w:pageBreakBefore w:val="0"/>
-      <w:spacing w:after="80" w:before="280" w:lineRule="auto"/>
+      <w:keepNext/>
+      <w:keepLines/>
+      <w:spacing w:before="280" w:after="80"/>
+      <w:outlineLvl w:val="3"/>
     </w:pPr>
     <w:rPr>
       <w:color w:val="666666"/>
@@ -349,45 +603,88 @@
     <w:name w:val="heading 5"/>
     <w:basedOn w:val="Normal"/>
     <w:next w:val="Normal"/>
+    <w:uiPriority w:val="9"/>
+    <w:semiHidden/>
+    <w:unhideWhenUsed/>
+    <w:qFormat/>
     <w:pPr>
-      <w:keepNext w:val="1"/>
-      <w:keepLines w:val="1"/>
-      <w:pageBreakBefore w:val="0"/>
-      <w:spacing w:after="80" w:before="240" w:lineRule="auto"/>
+      <w:keepNext/>
+      <w:keepLines/>
+      <w:spacing w:before="240" w:after="80"/>
+      <w:outlineLvl w:val="4"/>
     </w:pPr>
     <w:rPr>
       <w:color w:val="666666"/>
-      <w:sz w:val="22"/>
-      <w:szCs w:val="22"/>
     </w:rPr>
   </w:style>
   <w:style w:type="paragraph" w:styleId="Heading6">
     <w:name w:val="heading 6"/>
     <w:basedOn w:val="Normal"/>
     <w:next w:val="Normal"/>
+    <w:uiPriority w:val="9"/>
+    <w:semiHidden/>
+    <w:unhideWhenUsed/>
+    <w:qFormat/>
     <w:pPr>
-      <w:keepNext w:val="1"/>
-      <w:keepLines w:val="1"/>
-      <w:pageBreakBefore w:val="0"/>
-      <w:spacing w:after="80" w:before="240" w:lineRule="auto"/>
+      <w:keepNext/>
+      <w:keepLines/>
+      <w:spacing w:before="240" w:after="80"/>
+      <w:outlineLvl w:val="5"/>
     </w:pPr>
     <w:rPr>
-      <w:i w:val="1"/>
-      <w:iCs w:val="1"/>
+      <w:i/>
+      <w:iCs/>
       <w:color w:val="666666"/>
-      <w:sz w:val="22"/>
-      <w:szCs w:val="22"/>
     </w:rPr>
+  </w:style>
+  <w:style w:type="character" w:default="1" w:styleId="DefaultParagraphFont">
+    <w:name w:val="Default Paragraph Font"/>
+    <w:uiPriority w:val="1"/>
+    <w:semiHidden/>
+    <w:unhideWhenUsed/>
+  </w:style>
+  <w:style w:type="table" w:default="1" w:styleId="TableNormal">
+    <w:name w:val="Normal Table"/>
+    <w:uiPriority w:val="99"/>
+    <w:semiHidden/>
+    <w:unhideWhenUsed/>
+    <w:tblPr>
+      <w:tblInd w:w="0" w:type="dxa"/>
+      <w:tblCellMar>
+        <w:top w:w="0" w:type="dxa"/>
+        <w:left w:w="108" w:type="dxa"/>
+        <w:bottom w:w="0" w:type="dxa"/>
+        <w:right w:w="108" w:type="dxa"/>
+      </w:tblCellMar>
+    </w:tblPr>
+  </w:style>
+  <w:style w:type="numbering" w:default="1" w:styleId="NoList">
+    <w:name w:val="No List"/>
+    <w:uiPriority w:val="99"/>
+    <w:semiHidden/>
+    <w:unhideWhenUsed/>
+  </w:style>
+  <w:style w:type="table" w:customStyle="1" w:styleId="TableNormal0">
+    <w:name w:val="TableNormal"/>
+    <w:tblPr>
+      <w:tblCellMar>
+        <w:top w:w="100" w:type="dxa"/>
+        <w:left w:w="100" w:type="dxa"/>
+        <w:bottom w:w="100" w:type="dxa"/>
+        <w:right w:w="100" w:type="dxa"/>
+      </w:tblCellMar>
+    </w:tblPr>
   </w:style>
   <w:style w:type="paragraph" w:styleId="Title">
     <w:name w:val="Title"/>
     <w:basedOn w:val="Normal"/>
     <w:next w:val="Normal"/>
+    <w:uiPriority w:val="10"/>
+    <w:qFormat/>
     <w:pPr>
-      <w:keepNext w:val="1"/>
-      <w:keepLines w:val="1"/>
-      <w:pageBreakBefore w:val="0"/>
-      <w:spacing w:after="60" w:before="0" w:lineRule="auto"/>
+      <w:keepNext/>
+      <w:keepLines/>
+      <w:spacing w:after="60"/>
     </w:pPr>
     <w:rPr>
       <w:sz w:val="52"/>
@@ -398,16 +695,14 @@
     <w:name w:val="Subtitle"/>
     <w:basedOn w:val="Normal"/>
     <w:next w:val="Normal"/>
+    <w:uiPriority w:val="11"/>
+    <w:qFormat/>
     <w:pPr>
-      <w:keepNext w:val="1"/>
-      <w:keepLines w:val="1"/>
-      <w:pageBreakBefore w:val="0"/>
-      <w:spacing w:after="320" w:before="0" w:lineRule="auto"/>
+      <w:keepNext/>
+      <w:keepLines/>
+      <w:spacing w:after="320"/>
     </w:pPr>
     <w:rPr>
-      <w:rFonts w:ascii="Arial" w:cs="Arial" w:eastAsia="Arial" w:hAnsi="Arial"/>
-      <w:i w:val="0"/>
-      <w:iCs w:val="0"/>
       <w:color w:val="666666"/>
       <w:sz w:val="30"/>
       <w:szCs w:val="30"/>

</xml_diff>